<commit_message>
Improve resume wording while preserving supplied Word formatting
</commit_message>
<xml_diff>
--- a/resume/Mohammed-Namir-Kazi-Resume.docx
+++ b/resume/Mohammed-Namir-Kazi-Resume.docx
@@ -75,7 +75,7 @@
     </w:p>
     <w:p>
       <w:r>
-        <w:t>Full stack developer building business applications with React, PHP, Node.js, and MySQL. Experience delivering visitor and employee management software, financial workflows, REST APIs, and cloud deployments. Information security and cloud internships support a practical focus on authentication, access control, production troubleshooting, and reliable data handling.</w:t>
+        <w:t>Full stack software developer building business applications with React, PHP, Node.js, and MySQL. Experience in visitor management, employee attendance, accounting workflows, REST APIs, and cloud deployment. Background in information security and cloud engineering, with practical experience in authentication, role-based access control, and production troubleshooting.</w:t>
       </w:r>
     </w:p>
     <w:p>
@@ -94,7 +94,7 @@
         <w:t xml:space="preserve">Development: </w:t>
       </w:r>
       <w:r>
-        <w:t>JavaScript, React, PHP, Node.js, Express.js, Python, Java, HTML, CSS, Bootstrap, REST APIs</w:t>
+        <w:t>JavaScript, React, PHP, Node.js, Express.js, Python, Java, SQL, HTML, CSS, Bootstrap, REST APIs</w:t>
       </w:r>
     </w:p>
     <w:p>
@@ -105,7 +105,7 @@
         <w:t xml:space="preserve">Data and application security: </w:t>
       </w:r>
       <w:r>
-        <w:t>MySQL, MongoDB, SQLite, JWT, role-based access control, Git, GitHub</w:t>
+        <w:t>MySQL, MongoDB, SQLite, JSON Web Tokens (JWT), role-based access control (RBAC), Git, GitHub</w:t>
       </w:r>
     </w:p>
     <w:p>
@@ -116,7 +116,7 @@
         <w:t xml:space="preserve">Cloud and infrastructure: </w:t>
       </w:r>
       <w:r>
-        <w:t>Google Cloud Platform, Microsoft Azure, Railway, Docker, Linux, WireGuard, Bash, PowerShell</w:t>
+        <w:t>Google Cloud Platform (GCP), Microsoft Azure, Railway, Docker, Linux, WireGuard, Bash, PowerShell</w:t>
       </w:r>
     </w:p>
     <w:p>
@@ -158,7 +158,7 @@
         <w:pStyle w:val="ListBullet"/>
       </w:pPr>
       <w:r>
-        <w:t>Developed and deployed enterprise web applications for visitor management, employee attendance, and business operations.</w:t>
+        <w:t>Developed and deployed web applications for visitor registration, employee attendance, and business operations using PHP, JavaScript, and MySQL.</w:t>
       </w:r>
     </w:p>
     <w:p>
@@ -166,7 +166,7 @@
         <w:pStyle w:val="ListBullet"/>
       </w:pPr>
       <w:r>
-        <w:t>Implemented facial recognition, authentication, role-based access, document uploads, and PDF and Excel reporting.</w:t>
+        <w:t>Implemented facial recognition, user authentication, role-based access control, document uploads, and PDF and Excel reports.</w:t>
       </w:r>
     </w:p>
     <w:p>
@@ -174,7 +174,7 @@
         <w:pStyle w:val="ListBullet"/>
       </w:pPr>
       <w:r>
-        <w:t>Built backend APIs, database structures, and responsive interfaces; resolved deployment, storage, networking, and browser issues in production.</w:t>
+        <w:t>Built REST APIs, database structures, and responsive interfaces; resolved deployment, storage, networking, and browser compatibility issues.</w:t>
       </w:r>
     </w:p>
     <w:p>
@@ -197,7 +197,7 @@
         <w:pStyle w:val="ListBullet"/>
       </w:pPr>
       <w:r>
-        <w:t>Conducted VAPT, documented vulnerabilities, and supported remediation prioritization and stakeholder risk reporting.</w:t>
+        <w:t>Performed Vulnerability Assessment and Penetration Testing (VAPT), documented findings, and supported remediation prioritization and risk reporting.</w:t>
       </w:r>
     </w:p>
     <w:p>
@@ -228,7 +228,7 @@
         <w:pStyle w:val="ListBullet"/>
       </w:pPr>
       <w:r>
-        <w:t>Built and maintained frontend and backend website components; supported technical SEO and Google Cloud Logging and Monitoring.</w:t>
+        <w:t>Developed frontend and backend website components; supported technical SEO, Google Cloud Logging, and Google Cloud Monitoring.</w:t>
       </w:r>
     </w:p>
     <w:p>
@@ -251,7 +251,7 @@
         <w:pStyle w:val="ListBullet"/>
       </w:pPr>
       <w:r>
-        <w:t>Supported Azure and GCP infrastructure, data migration, monitoring, identity and access management, and secure storage policies.</w:t>
+        <w:t>Supported Microsoft Azure and GCP infrastructure, cloud data migration, monitoring, identity and access management (IAM), and storage policies.</w:t>
       </w:r>
     </w:p>
     <w:p>
@@ -287,7 +287,7 @@
         <w:pStyle w:val="ListBullet"/>
       </w:pPr>
       <w:r>
-        <w:t>Built an accounting application with sales, receipts, payments, expenses, ledgers, investor capital tracking, and printable vouchers.</w:t>
+        <w:t>Built sales, receipts, payments, expenses, ledgers, investor capital tracking, and printable vouchers using React, PHP, and MySQL.</w:t>
       </w:r>
     </w:p>
     <w:p>
@@ -295,7 +295,7 @@
         <w:pStyle w:val="ListBullet"/>
       </w:pPr>
       <w:r>
-        <w:t>Structured separate accounting and funds portals, protected routes, company management, and financial dashboards.</w:t>
+        <w:t>Implemented accounting and funds portals, protected routes, company management, and financial dashboards.</w:t>
       </w:r>
     </w:p>
     <w:p>
@@ -318,7 +318,7 @@
         <w:pStyle w:val="ListBullet"/>
       </w:pPr>
       <w:r>
-        <w:t>Developed currency buy, sell, and exchange workflows with balances, opening entries, transaction history, and reconciliation.</w:t>
+        <w:t>Developed currency trading, balance management, opening entries, transaction history, and reconciliation workflows.</w:t>
       </w:r>
     </w:p>
     <w:p>
@@ -326,7 +326,7 @@
         <w:pStyle w:val="ListBullet"/>
       </w:pPr>
       <w:r>
-        <w:t>Added financial facility approval, disbursement, repayment, and ledger workflows, with company and user administration.</w:t>
+        <w:t>Implemented financial facility approvals, disbursements, repayments, ledger entries, and company and user administration.</w:t>
       </w:r>
     </w:p>
     <w:p>
@@ -349,7 +349,7 @@
         <w:pStyle w:val="ListBullet"/>
       </w:pPr>
       <w:r>
-        <w:t>Delivered visitor check-in and checkout, employee attendance, face identification, document handling, and automated exports.</w:t>
+        <w:t>Built visitor check-in and checkout, employee attendance, facial identification, document handling, and automated reporting.</w:t>
       </w:r>
     </w:p>
     <w:p>
@@ -357,7 +357,7 @@
         <w:pStyle w:val="ListBullet"/>
       </w:pPr>
       <w:r>
-        <w:t>Extended operational tracking with driver trips, location updates, and trip reports; supported Railway deployment and persistent storage.</w:t>
+        <w:t>Added driver trip tracking, location updates, and trip reports; supported Railway deployment and persistent storage.</w:t>
       </w:r>
     </w:p>
     <w:p>
@@ -380,7 +380,7 @@
         <w:pStyle w:val="ListBullet"/>
       </w:pPr>
       <w:r>
-        <w:t>Built a Nile testnet gateway with deposit wallet generation, blockchain polling, confirmation tracking, and transaction history.</w:t>
+        <w:t>Built a TRON Nile testnet gateway with deposit wallet generation, TRC20 USDT polling, confirmation tracking, and transaction history.</w:t>
       </w:r>
     </w:p>
     <w:p>
@@ -388,7 +388,7 @@
         <w:pStyle w:val="ListBullet"/>
       </w:pPr>
       <w:r>
-        <w:t>Implemented encrypted key storage, JWT authentication, and manual treasury sweeping through an administration dashboard.</w:t>
+        <w:t>Implemented encrypted key storage, JWT authentication, and manual treasury transfers through an administration dashboard.</w:t>
       </w:r>
     </w:p>
     <w:p>
@@ -411,7 +411,7 @@
         <w:pStyle w:val="ListBullet"/>
       </w:pPr>
       <w:r>
-        <w:t>Quick Jot: MERN notes app with JWT authentication and Redux Toolkit. GeoLogix: PHP and MySQL attendance system using geolocation.</w:t>
+        <w:t>Quick Jot: MERN notes application with JWT authentication and Redux Toolkit. GeoLogix: PHP and MySQL attendance application with geolocation.</w:t>
       </w:r>
     </w:p>
     <w:p>
@@ -419,7 +419,7 @@
         <w:pStyle w:val="ListBullet"/>
       </w:pPr>
       <w:r>
-        <w:t>Solidity attendance prototype; Python Discord bot using Gemini and conversation context; PHP book recommendation website.</w:t>
+        <w:t>Built a Solidity attendance prototype, a Python Discord bot using the Gemini API and conversation context, and a PHP book recommendation website.</w:t>
       </w:r>
     </w:p>
     <w:p>
@@ -427,7 +427,7 @@
         <w:pStyle w:val="ListBullet"/>
       </w:pPr>
       <w:r>
-        <w:t>WireGuard VPN on GCP with Linux routing, NAT, firewall rules, and client provisioning. Academic work: donation platform, roadside assistance, Android stress support app, and Arduino fire detection prototype.</w:t>
+        <w:t>Configured WireGuard VPN on GCP with Linux routing, NAT, firewall rules, and client provisioning. Academic projects: donation platform, roadside assistance, Android stress support application, and Arduino fire detection.</w:t>
       </w:r>
     </w:p>
     <w:p>

</xml_diff>